<commit_message>
Docs: update installation guide in README
</commit_message>
<xml_diff>
--- a/documents/Степанова_ЕВ.docx
+++ b/documents/Степанова_ЕВ.docx
@@ -1450,6 +1450,7 @@
           <w:color w:val="262626"/>
           <w:sz w:val="28"/>
           <w:szCs w:val="28"/>
+          <w:lang w:val="ru-RU"/>
         </w:rPr>
       </w:pPr>
       <w:r>
@@ -1458,8 +1459,95 @@
           <w:color w:val="262626"/>
           <w:sz w:val="28"/>
           <w:szCs w:val="28"/>
-        </w:rPr>
-        <w:t xml:space="preserve">Установка </w:t>
+          <w:lang w:val="ru-RU"/>
+        </w:rPr>
+        <w:t xml:space="preserve">Создание </w:t>
+      </w:r>
+      <w:r>
+        <w:rPr>
+          <w:rFonts w:ascii="Times New Roman" w:eastAsia="Times New Roman" w:hAnsi="Times New Roman" w:cs="Times New Roman"/>
+          <w:color w:val="262626"/>
+          <w:sz w:val="28"/>
+          <w:szCs w:val="28"/>
+          <w:lang w:val="ru-RU"/>
+        </w:rPr>
+        <w:t>директории проекта</w:t>
+      </w:r>
+      <w:r>
+        <w:rPr>
+          <w:rFonts w:ascii="Times New Roman" w:eastAsia="Times New Roman" w:hAnsi="Times New Roman" w:cs="Times New Roman"/>
+          <w:color w:val="262626"/>
+          <w:sz w:val="28"/>
+          <w:szCs w:val="28"/>
+          <w:lang w:val="ru-RU"/>
+        </w:rPr>
+        <w:t>.</w:t>
+      </w:r>
+    </w:p>
+    <w:p>
+      <w:pPr>
+        <w:shd w:val="clear" w:color="auto" w:fill="FFFFFF"/>
+        <w:ind w:firstLine="720"/>
+        <w:jc w:val="both"/>
+        <w:rPr>
+          <w:rFonts w:ascii="Times New Roman" w:eastAsia="Times New Roman" w:hAnsi="Times New Roman" w:cs="Times New Roman"/>
+          <w:color w:val="262626"/>
+          <w:sz w:val="28"/>
+          <w:szCs w:val="28"/>
+          <w:lang w:val="ru-RU"/>
+        </w:rPr>
+      </w:pPr>
+    </w:p>
+    <w:p>
+      <w:pPr>
+        <w:shd w:val="clear" w:color="auto" w:fill="FFFFFF"/>
+        <w:ind w:firstLine="720"/>
+        <w:jc w:val="both"/>
+        <w:rPr>
+          <w:rFonts w:ascii="Times New Roman" w:eastAsia="Times New Roman" w:hAnsi="Times New Roman" w:cs="Times New Roman"/>
+          <w:color w:val="262626"/>
+          <w:sz w:val="28"/>
+          <w:szCs w:val="28"/>
+          <w:lang w:val="ru-RU"/>
+        </w:rPr>
+      </w:pPr>
+    </w:p>
+    <w:p>
+      <w:pPr>
+        <w:shd w:val="clear" w:color="auto" w:fill="FFFFFF"/>
+        <w:ind w:firstLine="720"/>
+        <w:jc w:val="both"/>
+        <w:rPr>
+          <w:rFonts w:ascii="Times New Roman" w:eastAsia="Times New Roman" w:hAnsi="Times New Roman" w:cs="Times New Roman"/>
+          <w:color w:val="262626"/>
+          <w:sz w:val="28"/>
+          <w:szCs w:val="28"/>
+          <w:lang w:val="ru-RU"/>
+        </w:rPr>
+      </w:pPr>
+    </w:p>
+    <w:p>
+      <w:pPr>
+        <w:shd w:val="clear" w:color="auto" w:fill="FFFFFF"/>
+        <w:ind w:firstLine="720"/>
+        <w:jc w:val="both"/>
+        <w:rPr>
+          <w:rFonts w:ascii="Times New Roman" w:eastAsia="Times New Roman" w:hAnsi="Times New Roman" w:cs="Times New Roman"/>
+          <w:color w:val="262626"/>
+          <w:sz w:val="28"/>
+          <w:szCs w:val="28"/>
+          <w:lang w:val="ru-RU"/>
+        </w:rPr>
+      </w:pPr>
+      <w:r>
+        <w:rPr>
+          <w:rFonts w:ascii="Times New Roman" w:eastAsia="Times New Roman" w:hAnsi="Times New Roman" w:cs="Times New Roman"/>
+          <w:color w:val="262626"/>
+          <w:sz w:val="28"/>
+          <w:szCs w:val="28"/>
+          <w:lang w:val="ru-RU"/>
+        </w:rPr>
+        <w:t>Проектирование классов.</w:t>
       </w:r>
     </w:p>
     <w:p>
@@ -1551,16 +1639,16 @@
           <w:sz w:val="28"/>
           <w:szCs w:val="28"/>
         </w:rPr>
-        <w:t>работы было</w:t>
-      </w:r>
-      <w:r>
-        <w:rPr>
-          <w:rFonts w:ascii="Times New Roman" w:eastAsia="Times New Roman" w:hAnsi="Times New Roman" w:cs="Times New Roman"/>
-          <w:sz w:val="28"/>
-          <w:szCs w:val="28"/>
-          <w:lang w:val="ru-RU"/>
-        </w:rPr>
-        <w:t xml:space="preserve"> </w:t>
+        <w:t>работы</w:t>
+      </w:r>
+      <w:r>
+        <w:rPr>
+          <w:rFonts w:ascii="Times New Roman" w:eastAsia="Times New Roman" w:hAnsi="Times New Roman" w:cs="Times New Roman"/>
+          <w:sz w:val="28"/>
+          <w:szCs w:val="28"/>
+          <w:lang w:val="ru-RU"/>
+        </w:rPr>
+        <w:t xml:space="preserve"> была разработана система автоматического форматирования текста, состоящая из четырёх основных компонентов. Система реализована на языке Python с использованием объектно-ориентированного подхода.</w:t>
       </w:r>
     </w:p>
     <w:sectPr>

</xml_diff>